<commit_message>
fix: complete repository health and delivery fixes
</commit_message>
<xml_diff>
--- a/reports/submission/AI能源技术报告初稿.docx
+++ b/reports/submission/AI能源技术报告初稿.docx
@@ -8,6 +8,11 @@
       </w:pPr>
       <w:r>
         <w:t>AI 能源技术报告初稿</w:t>
+      </w:r>
+    </w:p>
+    <w:p>
+      <w:r>
+        <w:t>2026-10-25 提交口径说明：本文历史预实验与当前电价同协议对决分开报告。当前电价总结统一引用 docs/18 §5：LightGBM MAE 9.52 / skill +26.9%，MQ-CNN 泄漏修正后 29.37 / −125.5%。保形校准已完成（PR #8），独立严格滚动 PICP80 0.642 → 0.756。LLM 调度仅为离线消融，未接入产品调度 API；本次接口弃光计数修复不改写已封存实验结果。</w:t>
       </w:r>
     </w:p>
     <w:p>

</xml_diff>